<commit_message>
docs: update PA0 Submission
</commit_message>
<xml_diff>
--- a/pa/PA0/T07-PA0.docx
+++ b/pa/PA0/T07-PA0.docx
@@ -892,7 +892,7 @@
     </w:p>
     <w:sdt>
       <w:sdtPr>
-        <w:id w:val="-1040342118"/>
+        <w:id w:val="1300326354"/>
         <w:docPartObj>
           <w:docPartGallery w:val="Table of Contents"/>
           <w:docPartUnique w:val="1"/>
@@ -3793,7 +3793,7 @@
             </w:pPr>
             <w:sdt>
               <w:sdtPr>
-                <w:id w:val="1784199571"/>
+                <w:id w:val="-1671888192"/>
                 <w:tag w:val="goog_rdk_0"/>
               </w:sdtPr>
               <w:sdtContent>
@@ -3849,7 +3849,7 @@
               <w:rPr>
                 <w:rtl w:val="0"/>
               </w:rPr>
-              <w:t xml:space="preserve">Discord server "UniEvent - T07" (https://discord.gg/zVMjhEGnzp); the TA is invited as a member</w:t>
+              <w:t xml:space="preserve">Discord server "UniEvent - T07" (https://discord.gg/zVMjhEGnzp); the TA will be invited as a member</w:t>
             </w:r>
           </w:p>
         </w:tc>
@@ -4075,7 +4075,7 @@
             </w:pPr>
             <w:sdt>
               <w:sdtPr>
-                <w:id w:val="-513154700"/>
+                <w:id w:val="-417863707"/>
                 <w:tag w:val="goog_rdk_1"/>
               </w:sdtPr>
               <w:sdtContent>
@@ -6037,7 +6037,7 @@
               <w:rPr>
                 <w:rtl w:val="0"/>
               </w:rPr>
-              <w:t xml:space="preserve">Students see their ticket and check-in status, with optional conduct score history.</w:t>
+              <w:t xml:space="preserve">Check-in data is kept as conduct score evidence: students see their attendance and conduct score history, and officers review conduct score claims in bulk.</w:t>
             </w:r>
           </w:p>
         </w:tc>
@@ -8279,7 +8279,7 @@
         <w:rPr>
           <w:rtl w:val="0"/>
         </w:rPr>
-        <w:t xml:space="preserve">Discord server "UniEvent - T07" (https://discord.gg/zVMjhEGnzp); the TA is invited as a member</w:t>
+        <w:t xml:space="preserve">Discord server "UniEvent - T07" (https://discord.gg/zVMjhEGnzp); the TA will be invited as a member</w:t>
       </w:r>
       <w:r>
         <w:rPr>
@@ -8491,7 +8491,7 @@
         <w:rPr>
           <w:rtl w:val="0"/>
         </w:rPr>
-        <w:t xml:space="preserve">tasks on the Notion board "UniEvent Tasks" (approved by the TA)</w:t>
+        <w:t xml:space="preserve">tasks as issues on the GitHub Project "Team Management" (https://github.com/orgs/UniEvent-T07/projects/1)</w:t>
       </w:r>
       <w:r>
         <w:rPr>
@@ -9073,7 +9073,7 @@
               <w:rPr>
                 <w:rtl w:val="0"/>
               </w:rPr>
-              <w:t xml:space="preserve">B</w:t>
+              <w:t xml:space="preserve">C</w:t>
             </w:r>
           </w:p>
         </w:tc>
@@ -9181,7 +9181,7 @@
               <w:rPr>
                 <w:rtl w:val="0"/>
               </w:rPr>
-              <w:t xml:space="preserve">A</w:t>
+              <w:t xml:space="preserve">D</w:t>
             </w:r>
           </w:p>
         </w:tc>
@@ -9235,7 +9235,7 @@
               <w:rPr>
                 <w:rtl w:val="0"/>
               </w:rPr>
-              <w:t xml:space="preserve">C</w:t>
+              <w:t xml:space="preserve">B</w:t>
             </w:r>
           </w:p>
         </w:tc>
@@ -10960,7 +10960,7 @@
             </w:pPr>
             <w:sdt>
               <w:sdtPr>
-                <w:id w:val="-1713050101"/>
+                <w:id w:val="85088149"/>
                 <w:tag w:val="goog_rdk_2"/>
               </w:sdtPr>
               <w:sdtContent>
@@ -10990,7 +10990,7 @@
             </w:pPr>
             <w:sdt>
               <w:sdtPr>
-                <w:id w:val="-1701598110"/>
+                <w:id w:val="1542277425"/>
                 <w:tag w:val="goog_rdk_3"/>
               </w:sdtPr>
               <w:sdtContent>
@@ -11021,7 +11021,7 @@
               <w:rPr>
                 <w:rtl w:val="0"/>
               </w:rPr>
-              <w:t xml:space="preserve">12/10/2026</w:t>
+              <w:t xml:space="preserve">14/10/2026</w:t>
             </w:r>
           </w:p>
         </w:tc>
@@ -11100,7 +11100,7 @@
               <w:rPr>
                 <w:rtl w:val="0"/>
               </w:rPr>
-              <w:t xml:space="preserve">12/10/2026 </w:t>
+              <w:t xml:space="preserve">14/10/2026 </w:t>
             </w:r>
           </w:p>
         </w:tc>
@@ -11152,7 +11152,7 @@
             </w:pPr>
             <w:sdt>
               <w:sdtPr>
-                <w:id w:val="-402140826"/>
+                <w:id w:val="-2009306943"/>
                 <w:tag w:val="goog_rdk_4"/>
               </w:sdtPr>
               <w:sdtContent>
@@ -11188,7 +11188,7 @@
               <w:rPr>
                 <w:rtl w:val="0"/>
               </w:rPr>
-              <w:t xml:space="preserve">12/10/2026 </w:t>
+              <w:t xml:space="preserve">14/10/2026 </w:t>
             </w:r>
           </w:p>
         </w:tc>
@@ -11267,7 +11267,7 @@
               <w:rPr>
                 <w:rtl w:val="0"/>
               </w:rPr>
-              <w:t xml:space="preserve">12/10/2026 </w:t>
+              <w:t xml:space="preserve">14/10/2026 </w:t>
             </w:r>
           </w:p>
         </w:tc>
@@ -11589,7 +11589,7 @@
             </w:pPr>
             <w:sdt>
               <w:sdtPr>
-                <w:id w:val="321849369"/>
+                <w:id w:val="1068897225"/>
                 <w:tag w:val="goog_rdk_5"/>
               </w:sdtPr>
               <w:sdtContent>
@@ -11637,7 +11637,7 @@
             </w:pPr>
             <w:sdt>
               <w:sdtPr>
-                <w:id w:val="-1776260481"/>
+                <w:id w:val="3919239"/>
                 <w:tag w:val="goog_rdk_6"/>
               </w:sdtPr>
               <w:sdtContent>
@@ -11827,7 +11827,7 @@
               <w:rPr>
                 <w:rtl w:val="0"/>
               </w:rPr>
-              <w:t xml:space="preserve">Updated the communication channel from Messenger to Discord after the team decided to move (Sections 1, 2.7, 3.2, 3.7), and set up the Discord server structure and the Notion-to-Discord task notification. After the TA approved Notion as the task board, also updated Section 3.2 (task board) and added the Discord invite link in Section 1. On 13/10/2026, also proofread the final version (Sections 2.4 and 2.5) and added the repository link in Section 3.2.</w:t>
+              <w:t xml:space="preserve">Updated the communication channel from Messenger to Discord after the team decided to move (Sections 1, 2.7, 3.2, 3.7), and set up the Discord server structure and the Notion-to-Discord task notification. After the TA approved Notion as the task board, also updated Section 3.2 (task board) and added the Discord invite link in Section 1. On 13/10/2026, also proofread the final version (Sections 2.4 and 2.5) and added the repository link in Section 3.2. On 14/10/2026, updated Section 3.2 again after the team moved the task board from Notion to GitHub Project, clarified that the TA will be invited to Discord (Sections 1 and 3.2) aligned F09 with the Target Users table, aligned the backup owners in Section 3.4 with the roles in Section 1, and updated the signature dates to 14/10/2026.</w:t>
             </w:r>
           </w:p>
         </w:tc>

</xml_diff>